<commit_message>
Added Riphah Konnect FYP documentation
</commit_message>
<xml_diff>
--- a/Riphah_Konnect_FYP_Doc.docx
+++ b/Riphah_Konnect_FYP_Doc.docx
@@ -827,7 +827,7 @@
                 </mc:Choice>
                 <mc:Fallback>
                   <w:pict>
-                    <v:line w14:anchorId="398FA595" id="Straight Connector 7" o:spid="_x0000_s1026" style="position:absolute;z-index:251659264;visibility:visible;mso-wrap-style:square;mso-width-percent:0;mso-height-percent:0;mso-wrap-distance-left:9pt;mso-wrap-distance-top:0;mso-wrap-distance-right:9pt;mso-wrap-distance-bottom:0;mso-position-horizontal:absolute;mso-position-horizontal-relative:text;mso-position-vertical:absolute;mso-position-vertical-relative:text;mso-width-percent:0;mso-height-percent:0;mso-width-relative:page;mso-height-relative:page" from=".3pt,8.95pt" to="189.3pt,8.95pt" o:gfxdata="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"/>
+                    <v:line w14:anchorId="766039E5" id="Straight Connector 7" o:spid="_x0000_s1026" style="position:absolute;z-index:251659264;visibility:visible;mso-wrap-style:square;mso-width-percent:0;mso-height-percent:0;mso-wrap-distance-left:9pt;mso-wrap-distance-top:0;mso-wrap-distance-right:9pt;mso-wrap-distance-bottom:0;mso-position-horizontal:absolute;mso-position-horizontal-relative:text;mso-position-vertical:absolute;mso-position-vertical-relative:text;mso-width-percent:0;mso-height-percent:0;mso-width-relative:page;mso-height-relative:page" from=".3pt,8.95pt" to="189.3pt,8.95pt" o:gfxdata="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"/>
                   </w:pict>
                 </mc:Fallback>
               </mc:AlternateContent>
@@ -1049,7 +1049,7 @@
                 </mc:Choice>
                 <mc:Fallback>
                   <w:pict>
-                    <v:line w14:anchorId="4B7C9E09" id="Straight Connector 6" o:spid="_x0000_s1026" style="position:absolute;z-index:251660288;visibility:visible;mso-wrap-style:square;mso-width-percent:0;mso-height-percent:0;mso-wrap-distance-left:9pt;mso-wrap-distance-top:0;mso-wrap-distance-right:9pt;mso-wrap-distance-bottom:0;mso-position-horizontal:absolute;mso-position-horizontal-relative:text;mso-position-vertical:absolute;mso-position-vertical-relative:text;mso-width-percent:0;mso-height-percent:0;mso-width-relative:page;mso-height-relative:page" from=".4pt,5.3pt" to="189.4pt,5.3pt" o:gfxdata="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"/>
+                    <v:line w14:anchorId="0E342637" id="Straight Connector 6" o:spid="_x0000_s1026" style="position:absolute;z-index:251660288;visibility:visible;mso-wrap-style:square;mso-width-percent:0;mso-height-percent:0;mso-wrap-distance-left:9pt;mso-wrap-distance-top:0;mso-wrap-distance-right:9pt;mso-wrap-distance-bottom:0;mso-position-horizontal:absolute;mso-position-horizontal-relative:text;mso-position-vertical:absolute;mso-position-vertical-relative:text;mso-width-percent:0;mso-height-percent:0;mso-width-relative:page;mso-height-relative:page" from=".4pt,5.3pt" to="189.4pt,5.3pt" o:gfxdata="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"/>
                   </w:pict>
                 </mc:Fallback>
               </mc:AlternateContent>
@@ -18539,71 +18539,54 @@
       <w:pPr>
         <w:spacing w:after="0" w:line="360" w:lineRule="auto"/>
       </w:pPr>
-      <w:bookmarkStart w:id="78" w:name="_GoBack"/>
-      <w:bookmarkEnd w:id="78"/>
     </w:p>
     <w:p>
       <w:pPr>
         <w:pStyle w:val="Heading2"/>
         <w:spacing w:line="360" w:lineRule="auto"/>
       </w:pPr>
-      <w:bookmarkStart w:id="79" w:name="_Toc227543955"/>
+      <w:bookmarkStart w:id="78" w:name="_Toc227543955"/>
       <w:r>
         <w:rPr>
           <w:rFonts w:ascii="Times New Roman" w:hAnsi="Times New Roman"/>
         </w:rPr>
         <w:t>4.6  Fully Addressed Use Cases</w:t>
       </w:r>
-      <w:bookmarkEnd w:id="79"/>
+      <w:bookmarkEnd w:id="78"/>
     </w:p>
     <w:p>
       <w:pPr>
         <w:pStyle w:val="Heading3"/>
         <w:spacing w:after="120" w:line="360" w:lineRule="auto"/>
       </w:pPr>
-      <w:bookmarkStart w:id="80" w:name="_Toc227543956"/>
+      <w:bookmarkStart w:id="79" w:name="_Toc227543956"/>
+      <w:r>
+        <w:rPr>
+          <w:rFonts w:ascii="Times New Roman" w:hAnsi="Times New Roman"/>
+        </w:rPr>
+        <w:t xml:space="preserve">4.6.1 </w:t>
+      </w:r>
       <w:r>
         <w:rPr>
           <w:rFonts w:ascii="Times New Roman" w:hAnsi="Times New Roman"/>
         </w:rPr>
         <w:t>Student / Teacher Use Cases</w:t>
       </w:r>
-      <w:bookmarkEnd w:id="80"/>
+      <w:bookmarkEnd w:id="79"/>
     </w:p>
     <w:p>
       <w:pPr>
         <w:pStyle w:val="TableCaption"/>
         <w:spacing w:before="200" w:after="60" w:line="360" w:lineRule="auto"/>
       </w:pPr>
-      <w:bookmarkStart w:id="81" w:name="_lt15"/>
-      <w:r>
-        <w:t xml:space="preserve">Table </w:t>
-      </w:r>
-      <w:r>
-        <w:fldChar w:fldCharType="begin"/>
-      </w:r>
-      <w:r>
-        <w:instrText xml:space="preserve"> SEQ Table \* ARABIC </w:instrText>
-      </w:r>
-      <w:r>
-        <w:fldChar w:fldCharType="separate"/>
-      </w:r>
-      <w:r>
-        <w:rPr>
-          <w:noProof/>
-        </w:rPr>
-        <w:t>13</w:t>
-      </w:r>
-      <w:r>
-        <w:rPr>
-          <w:noProof/>
-        </w:rPr>
-        <w:fldChar w:fldCharType="end"/>
-      </w:r>
-      <w:r>
-        <w:t>: Use Case: Login to System</w:t>
-      </w:r>
-      <w:bookmarkEnd w:id="81"/>
+      <w:bookmarkStart w:id="80" w:name="_lt15"/>
+      <w:r>
+        <w:t>Table</w:t>
+      </w:r>
+      <w:r>
+        <w:t xml:space="preserve"> 4.6.1.1</w:t>
+      </w:r>
+      <w:bookmarkEnd w:id="80"/>
     </w:p>
     <w:tbl>
       <w:tblPr>
@@ -18978,35 +18961,14 @@
         <w:pStyle w:val="TableCaption"/>
         <w:spacing w:before="200" w:after="60" w:line="360" w:lineRule="auto"/>
       </w:pPr>
-      <w:bookmarkStart w:id="82" w:name="_lt16"/>
-      <w:r>
-        <w:t xml:space="preserve">Table </w:t>
-      </w:r>
-      <w:r>
-        <w:fldChar w:fldCharType="begin"/>
-      </w:r>
-      <w:r>
-        <w:instrText xml:space="preserve"> SEQ Table \* ARABIC </w:instrText>
-      </w:r>
-      <w:r>
-        <w:fldChar w:fldCharType="separate"/>
-      </w:r>
-      <w:r>
-        <w:rPr>
-          <w:noProof/>
-        </w:rPr>
-        <w:t>14</w:t>
-      </w:r>
-      <w:r>
-        <w:rPr>
-          <w:noProof/>
-        </w:rPr>
-        <w:fldChar w:fldCharType="end"/>
-      </w:r>
-      <w:r>
-        <w:t>: Use Case: Create Post</w:t>
-      </w:r>
-      <w:bookmarkEnd w:id="82"/>
+      <w:bookmarkStart w:id="81" w:name="_lt16"/>
+      <w:r>
+        <w:t>Table</w:t>
+      </w:r>
+      <w:r>
+        <w:t xml:space="preserve"> 4.6.1.2</w:t>
+      </w:r>
+      <w:bookmarkEnd w:id="81"/>
     </w:p>
     <w:tbl>
       <w:tblPr>
@@ -19389,35 +19351,14 @@
         <w:pStyle w:val="TableCaption"/>
         <w:spacing w:before="200" w:after="60" w:line="360" w:lineRule="auto"/>
       </w:pPr>
-      <w:bookmarkStart w:id="83" w:name="_lt17"/>
-      <w:r>
-        <w:t xml:space="preserve">Table </w:t>
-      </w:r>
-      <w:r>
-        <w:fldChar w:fldCharType="begin"/>
-      </w:r>
-      <w:r>
-        <w:instrText xml:space="preserve"> SEQ Table \* ARABIC </w:instrText>
-      </w:r>
-      <w:r>
-        <w:fldChar w:fldCharType="separate"/>
-      </w:r>
-      <w:r>
-        <w:rPr>
-          <w:noProof/>
-        </w:rPr>
-        <w:t>15</w:t>
-      </w:r>
-      <w:r>
-        <w:rPr>
-          <w:noProof/>
-        </w:rPr>
-        <w:fldChar w:fldCharType="end"/>
-      </w:r>
-      <w:r>
-        <w:t>: Use Case: Like and Comment on Post</w:t>
-      </w:r>
-      <w:bookmarkEnd w:id="83"/>
+      <w:bookmarkStart w:id="82" w:name="_lt17"/>
+      <w:r>
+        <w:t>Table</w:t>
+      </w:r>
+      <w:r>
+        <w:t xml:space="preserve"> 4.6.1.3 </w:t>
+      </w:r>
+      <w:bookmarkEnd w:id="82"/>
     </w:p>
     <w:tbl>
       <w:tblPr>
@@ -19791,35 +19732,14 @@
         <w:pStyle w:val="TableCaption"/>
         <w:spacing w:before="200" w:after="60" w:line="360" w:lineRule="auto"/>
       </w:pPr>
-      <w:bookmarkStart w:id="84" w:name="_lt18"/>
-      <w:r>
-        <w:t xml:space="preserve">Table </w:t>
-      </w:r>
-      <w:r>
-        <w:fldChar w:fldCharType="begin"/>
-      </w:r>
-      <w:r>
-        <w:instrText xml:space="preserve"> SEQ Table \* ARABIC </w:instrText>
-      </w:r>
-      <w:r>
-        <w:fldChar w:fldCharType="separate"/>
-      </w:r>
-      <w:r>
-        <w:rPr>
-          <w:noProof/>
-        </w:rPr>
-        <w:t>16</w:t>
-      </w:r>
-      <w:r>
-        <w:rPr>
-          <w:noProof/>
-        </w:rPr>
-        <w:fldChar w:fldCharType="end"/>
-      </w:r>
-      <w:r>
-        <w:t>: Use Case: Join Semester Group</w:t>
-      </w:r>
-      <w:bookmarkEnd w:id="84"/>
+      <w:bookmarkStart w:id="83" w:name="_lt18"/>
+      <w:r>
+        <w:t>Table</w:t>
+      </w:r>
+      <w:r>
+        <w:t xml:space="preserve"> 4.6.1.4</w:t>
+      </w:r>
+      <w:bookmarkEnd w:id="83"/>
     </w:p>
     <w:tbl>
       <w:tblPr>
@@ -20201,35 +20121,14 @@
         <w:pStyle w:val="TableCaption"/>
         <w:spacing w:before="200" w:after="60" w:line="360" w:lineRule="auto"/>
       </w:pPr>
-      <w:bookmarkStart w:id="85" w:name="_lt19"/>
-      <w:r>
-        <w:t xml:space="preserve">Table </w:t>
-      </w:r>
-      <w:r>
-        <w:fldChar w:fldCharType="begin"/>
-      </w:r>
-      <w:r>
-        <w:instrText xml:space="preserve"> SEQ Table \* ARABIC </w:instrText>
-      </w:r>
-      <w:r>
-        <w:fldChar w:fldCharType="separate"/>
-      </w:r>
-      <w:r>
-        <w:rPr>
-          <w:noProof/>
-        </w:rPr>
-        <w:t>17</w:t>
-      </w:r>
-      <w:r>
-        <w:rPr>
-          <w:noProof/>
-        </w:rPr>
-        <w:fldChar w:fldCharType="end"/>
-      </w:r>
-      <w:r>
-        <w:t>: Use Case: RSVP to Campus Event</w:t>
-      </w:r>
-      <w:bookmarkEnd w:id="85"/>
+      <w:bookmarkStart w:id="84" w:name="_lt19"/>
+      <w:r>
+        <w:t>Table</w:t>
+      </w:r>
+      <w:r>
+        <w:t xml:space="preserve"> 4.6.1.5</w:t>
+      </w:r>
+      <w:bookmarkEnd w:id="84"/>
     </w:p>
     <w:tbl>
       <w:tblPr>
@@ -20603,35 +20502,14 @@
         <w:pStyle w:val="TableCaption"/>
         <w:spacing w:before="200" w:after="60" w:line="360" w:lineRule="auto"/>
       </w:pPr>
-      <w:bookmarkStart w:id="86" w:name="_lt20"/>
+      <w:bookmarkStart w:id="85" w:name="_lt20"/>
       <w:r>
         <w:t xml:space="preserve">Table </w:t>
       </w:r>
-      <w:r>
-        <w:fldChar w:fldCharType="begin"/>
-      </w:r>
-      <w:r>
-        <w:instrText xml:space="preserve"> SEQ Table \* ARABIC </w:instrText>
-      </w:r>
-      <w:r>
-        <w:fldChar w:fldCharType="separate"/>
-      </w:r>
-      <w:r>
-        <w:rPr>
-          <w:noProof/>
-        </w:rPr>
-        <w:t>18</w:t>
-      </w:r>
-      <w:r>
-        <w:rPr>
-          <w:noProof/>
-        </w:rPr>
-        <w:fldChar w:fldCharType="end"/>
-      </w:r>
-      <w:r>
-        <w:t>: Use Case: Report Lost/Found Item</w:t>
-      </w:r>
-      <w:bookmarkEnd w:id="86"/>
+      <w:bookmarkEnd w:id="85"/>
+      <w:r>
+        <w:t>4.6.1.6</w:t>
+      </w:r>
     </w:p>
     <w:tbl>
       <w:tblPr>
@@ -21030,35 +20908,17 @@
         <w:pStyle w:val="TableCaption"/>
         <w:spacing w:before="200" w:after="60" w:line="360" w:lineRule="auto"/>
       </w:pPr>
-      <w:bookmarkStart w:id="87" w:name="_lt21"/>
+      <w:bookmarkStart w:id="86" w:name="_lt21"/>
       <w:r>
         <w:t xml:space="preserve">Table </w:t>
       </w:r>
-      <w:r>
-        <w:fldChar w:fldCharType="begin"/>
-      </w:r>
-      <w:r>
-        <w:instrText xml:space="preserve"> SEQ Table \* ARABIC </w:instrText>
-      </w:r>
-      <w:r>
-        <w:fldChar w:fldCharType="separate"/>
-      </w:r>
-      <w:r>
-        <w:rPr>
-          <w:noProof/>
-        </w:rPr>
-        <w:t>19</w:t>
-      </w:r>
-      <w:r>
-        <w:rPr>
-          <w:noProof/>
-        </w:rPr>
-        <w:fldChar w:fldCharType="end"/>
-      </w:r>
-      <w:r>
-        <w:t>: Use Case: Mark Lost/Found Item as Resolved</w:t>
-      </w:r>
-      <w:bookmarkEnd w:id="87"/>
+      <w:bookmarkEnd w:id="86"/>
+      <w:r>
+        <w:t>4.6.1.</w:t>
+      </w:r>
+      <w:r>
+        <w:t>7</w:t>
+      </w:r>
     </w:p>
     <w:tbl>
       <w:tblPr>
@@ -21448,36 +21308,18 @@
         <w:pStyle w:val="TableCaption"/>
         <w:spacing w:before="200" w:after="60" w:line="360" w:lineRule="auto"/>
       </w:pPr>
-      <w:bookmarkStart w:id="88" w:name="_lt22"/>
+      <w:bookmarkStart w:id="87" w:name="_lt22"/>
       <w:r>
         <w:lastRenderedPageBreak/>
         <w:t xml:space="preserve">Table </w:t>
       </w:r>
-      <w:r>
-        <w:fldChar w:fldCharType="begin"/>
-      </w:r>
-      <w:r>
-        <w:instrText xml:space="preserve"> SEQ Table \* ARABIC </w:instrText>
-      </w:r>
-      <w:r>
-        <w:fldChar w:fldCharType="separate"/>
-      </w:r>
-      <w:r>
-        <w:rPr>
-          <w:noProof/>
-        </w:rPr>
-        <w:t>20</w:t>
-      </w:r>
-      <w:r>
-        <w:rPr>
-          <w:noProof/>
-        </w:rPr>
-        <w:fldChar w:fldCharType="end"/>
-      </w:r>
-      <w:r>
-        <w:t>: Use Case: Send Message</w:t>
-      </w:r>
-      <w:bookmarkEnd w:id="88"/>
+      <w:bookmarkEnd w:id="87"/>
+      <w:r>
+        <w:t>4.6.1.</w:t>
+      </w:r>
+      <w:r>
+        <w:t>8</w:t>
+      </w:r>
     </w:p>
     <w:tbl>
       <w:tblPr>
@@ -21859,35 +21701,17 @@
         <w:pStyle w:val="TableCaption"/>
         <w:spacing w:before="200" w:after="60" w:line="360" w:lineRule="auto"/>
       </w:pPr>
-      <w:bookmarkStart w:id="89" w:name="_lt23"/>
+      <w:bookmarkStart w:id="88" w:name="_lt23"/>
       <w:r>
         <w:t xml:space="preserve">Table </w:t>
       </w:r>
-      <w:r>
-        <w:fldChar w:fldCharType="begin"/>
-      </w:r>
-      <w:r>
-        <w:instrText xml:space="preserve"> SEQ Table \* ARABIC </w:instrText>
-      </w:r>
-      <w:r>
-        <w:fldChar w:fldCharType="separate"/>
-      </w:r>
-      <w:r>
-        <w:rPr>
-          <w:noProof/>
-        </w:rPr>
-        <w:t>21</w:t>
-      </w:r>
-      <w:r>
-        <w:rPr>
-          <w:noProof/>
-        </w:rPr>
-        <w:fldChar w:fldCharType="end"/>
-      </w:r>
-      <w:r>
-        <w:t>: Use Case: View and Update Profile</w:t>
-      </w:r>
-      <w:bookmarkEnd w:id="89"/>
+      <w:bookmarkEnd w:id="88"/>
+      <w:r>
+        <w:t>4.6.1.</w:t>
+      </w:r>
+      <w:r>
+        <w:t>9</w:t>
+      </w:r>
     </w:p>
     <w:tbl>
       <w:tblPr>
@@ -22270,35 +22094,17 @@
         <w:pStyle w:val="TableCaption"/>
         <w:spacing w:before="200" w:after="60" w:line="360" w:lineRule="auto"/>
       </w:pPr>
-      <w:bookmarkStart w:id="90" w:name="_lt24"/>
+      <w:bookmarkStart w:id="89" w:name="_lt24"/>
       <w:r>
         <w:t xml:space="preserve">Table </w:t>
       </w:r>
-      <w:r>
-        <w:fldChar w:fldCharType="begin"/>
-      </w:r>
-      <w:r>
-        <w:instrText xml:space="preserve"> SEQ Table \* ARABIC </w:instrText>
-      </w:r>
-      <w:r>
-        <w:fldChar w:fldCharType="separate"/>
-      </w:r>
-      <w:r>
-        <w:rPr>
-          <w:noProof/>
-        </w:rPr>
-        <w:t>22</w:t>
-      </w:r>
-      <w:r>
-        <w:rPr>
-          <w:noProof/>
-        </w:rPr>
-        <w:fldChar w:fldCharType="end"/>
-      </w:r>
-      <w:r>
-        <w:t>: Use Case: View Announcements</w:t>
-      </w:r>
-      <w:bookmarkEnd w:id="90"/>
+      <w:bookmarkEnd w:id="89"/>
+      <w:r>
+        <w:t>4.6.1.</w:t>
+      </w:r>
+      <w:r>
+        <w:t>10</w:t>
+      </w:r>
     </w:p>
     <w:tbl>
       <w:tblPr>
@@ -22664,14 +22470,22 @@
         <w:pStyle w:val="Heading3"/>
         <w:spacing w:after="120" w:line="360" w:lineRule="auto"/>
       </w:pPr>
-      <w:bookmarkStart w:id="91" w:name="_Toc227543957"/>
+      <w:bookmarkStart w:id="90" w:name="_Toc227543957"/>
+      <w:r>
+        <w:rPr>
+          <w:rFonts w:ascii="Times New Roman" w:hAnsi="Times New Roman"/>
+        </w:rPr>
+        <w:t xml:space="preserve">4.6.2 </w:t>
+      </w:r>
+      <w:bookmarkStart w:id="91" w:name="_GoBack"/>
+      <w:bookmarkEnd w:id="91"/>
       <w:r>
         <w:rPr>
           <w:rFonts w:ascii="Times New Roman" w:hAnsi="Times New Roman"/>
         </w:rPr>
         <w:t>Coordination / Administration / Admin Use Cases</w:t>
       </w:r>
-      <w:bookmarkEnd w:id="91"/>
+      <w:bookmarkEnd w:id="90"/>
     </w:p>
     <w:p>
       <w:pPr>
@@ -26337,7 +26151,7 @@
         <w:noProof/>
         <w:sz w:val="20"/>
       </w:rPr>
-      <w:t>23</w:t>
+      <w:t>31</w:t>
     </w:r>
     <w:r>
       <w:rPr>
@@ -38382,7 +38196,7 @@
 </file>
 
 <file path=customXml/itemProps1.xml><?xml version="1.0" encoding="utf-8"?>
-<ds:datastoreItem xmlns:ds="http://schemas.openxmlformats.org/officeDocument/2006/customXml" ds:itemID="{529F1895-F049-43E6-9020-E560673E3183}">
+<ds:datastoreItem xmlns:ds="http://schemas.openxmlformats.org/officeDocument/2006/customXml" ds:itemID="{612ECAEB-F8C0-4E16-82A4-5F2FA4D32DF0}">
   <ds:schemaRefs>
     <ds:schemaRef ds:uri="http://schemas.openxmlformats.org/officeDocument/2006/bibliography"/>
   </ds:schemaRefs>

</xml_diff>